<commit_message>
starting work on stage 0
</commit_message>
<xml_diff>
--- a/Sentinel_V4.docx
+++ b/Sentinel_V4.docx
@@ -404,7 +404,7 @@
           <w:i w:val="false"/>
           <w:iCs w:val="false"/>
         </w:rPr>
-        <w:t xml:space="preserve">The same lab has since extended this line of work directly. Zheng, Ji, Sun, Chen, Gao, and Srivastava’s ProMind-LLM [59] — the identical six-author group behind MindGuard, with first authorship rotated from Ji to Zheng, and explicitly cited by its own authors as building on “MindGuard: towards accessible and sitgma-free mental health first aid via edge LLM” — replaces MindGuard’s retrieval-style architecture with causal chain-of-thought reasoning over the same combination of objective sensor data and subjective mental records, specifically to address a failure mode direct self-report shares with Sentinel’s own EMA layer: subjective mood records can be distorted by transient mental state or a person’s momentary willingness to disclose. Evaluated on two public behavioral datasets (PMData, Globem), ProMind-LLM ranks second only to GPT-4o among all tested models — ahead of open-source baselines more than an order of magnitude larger — and, notably for Sentinel’s own model-sizing choice, the authors explicitly select smaller 7–8B-parameter base models over larger alternatives “prioritizing the future deployment of this application on the edge devices.” That target footprint remains meaningfully larger than the approximately 2B-parameter Gemma 4 E2B this paper specifies (Section 3.3); ProMind-LLM is evidence that this research lineage is converging toward edge deployment as a design goal, not evidence that its current models already fit Sentinel’s own hardware envelope. Because ProMind-LLM and MindGuard share their entire author list, the two should be read as sequential output from one research program rather than as independent validations of the same underlying approach — a distinction Section 2.7 returns to.</w:t>
+        <w:t xml:space="preserve">The same lab has since extended this line of work directly. Zheng, Ji, Sun, Chen, Gao, and Srivastava’s ProMind-LLM [59] — the identical six-author group behind MindGuard, with first authorship rotated from Ji to Zheng, and explicitly self-cited by its authors as building on their own prior MindGuard system [57] — replaces MindGuard’s retrieval-style architecture with causal chain-of-thought reasoning over the same combination of objective sensor data and subjective mental records, specifically to address a failure mode direct self-report shares with Sentinel’s own EMA layer: subjective mood records can be distorted by transient mental state or a person’s momentary willingness to disclose. Evaluated on two public behavioral datasets (PMData, Globem), ProMind-LLM ranks second only to GPT-4o among all tested models — ahead of open-source baselines more than an order of magnitude larger — and, notably for Sentinel’s own model-sizing choice, the authors explicitly select smaller 7–8B-parameter base models over larger alternatives “prioritizing the future deployment of this application on the edge devices.” That target footprint remains meaningfully larger than the approximately 2B-parameter Gemma 4 E2B this paper specifies (Section 3.3); ProMind-LLM is evidence that this research lineage is converging toward edge deployment as a design goal, not evidence that its current models already fit Sentinel’s own hardware envelope. Because ProMind-LLM and MindGuard share their entire author list, the two should be read as sequential output from one research program rather than as independent validations of the same underlying approach — a distinction Section 2.7 returns to.</w:t>
       </w:r>
     </w:p>
     <w:p>
@@ -2625,7 +2625,7 @@
           <w:i w:val="false"/>
           <w:iCs w:val="false"/>
         </w:rPr>
-        <w:t xml:space="preserve">Apparent empathy and correct interpretation are separable, and only the latter should be treated as safety-relevant. Current large language models, despite guardrails, still generate inaccurate or unsafe advice in a minority of self-harm scenarios [36], and sustained sycophantic validation has been documented to worsen delusional and manic states in vulnerable users [31]. Separately, culturally coded expressions of distress — idioms that do not map cleanly onto Western diagnostic constructs [32, 33] — risk systematic misinterpretation by a system tuned on largely Western/English training data, a concern directly relevant given Tele MANAS’s own 20-language operating scope [14, 34, 35]. Section 4.3’s Stage 2 red-team battery exists specifically to test this axis before deployment.</w:t>
+        <w:t xml:space="preserve">Apparent empathy and correct interpretation are separable, and only the latter should be treated as safety-relevant. Current guardrail classifiers report strong benchmark accuracy that degrades substantially on novel phrasing rather than familiar test cases — one recent evaluation found a leading guardrail model's accuracy fall from 91.0% on public benchmark prompts to 33.8% on unseen ones, a 57-point gap [36] — which is precisely the generalization failure mode EmoGuard and the interpretive-robustness battery below exist to probe for in Sentinel's own generation layer, rather than assuming benchmark performance transfers. Sustained sycophantic validation has separately been documented to worsen delusional and manic states in vulnerable users [31]. Culturally coded expressions of distress — idioms that do not map cleanly onto Western diagnostic constructs [32, 33] — risk a further, distinct form of systematic misinterpretation by a system tuned on largely Western/English training data, a concern directly relevant given Tele MANAS’s own 20-language operating scope [14, 34, 35]. Section 4.3’s Stage 2 red-team battery exists specifically to test this axis before deployment.</w:t>
       </w:r>
     </w:p>
     <w:p>
@@ -3172,7 +3172,7 @@
           <w:sz w:val="21"/>
           <w:szCs w:val="21"/>
         </w:rPr>
-        <w:t xml:space="preserve">[19] Belsher BE, et al. Prediction models for suicide attempts and deaths: a systematic review and simulation. (Primary citation to be independently verified before submission; referenced here via secondary literature describing near-chance predictive accuracy for actual suicide events despite high aggregate classification accuracy.)</w:t>
+        <w:t xml:space="preserve">[19] Belsher BE, Smolenski DJ, Pruitt LD, Bush NE, Beech EH, Workman DE, Morgan RL, Evatt DP, Tucker J, Skopp NA. Prediction models for suicide attempts and deaths: a systematic review and simulation. JAMA Psychiatry. 2019;76(6):642-651.</w:t>
       </w:r>
     </w:p>
     <w:p>
@@ -3393,20 +3393,20 @@
           <w:sz w:val="21"/>
           <w:szCs w:val="21"/>
         </w:rPr>
-        <w:t xml:space="preserve">[36] Kolding S, et al. LLM guardrail performance in self-harm scenarios, 2024. (Primary citation to be independently verified before submission.)</w:t>
-      </w:r>
-    </w:p>
-    <w:p>
-      <w:pPr>
-        <w:spacing w:after="140" w:line="264"/>
-        <w:ind w:left="432" w:hanging="432"/>
-      </w:pPr>
-      <w:r>
-        <w:rPr>
-          <w:sz w:val="21"/>
-          <w:szCs w:val="21"/>
-        </w:rPr>
-        <w:t xml:space="preserve">[37] Scoping review of reviews: artificial intelligence in mental health care. Front Psychiatry. 2026.</w:t>
+        <w:t xml:space="preserve">[36] Young RJ. Evaluating the robustness of large language model safety guardrails against adversarial attacks. arXiv:2511.22047, 2025.</w:t>
+      </w:r>
+    </w:p>
+    <w:p>
+      <w:pPr>
+        <w:spacing w:after="140" w:line="264"/>
+        <w:ind w:left="432" w:hanging="432"/>
+      </w:pPr>
+      <w:r>
+        <w:rPr>
+          <w:sz w:val="21"/>
+          <w:szCs w:val="21"/>
+        </w:rPr>
+        <w:t xml:space="preserve">[37] Abu-Mahfouz MS, AlFehaid S, Burqan HM, El Arab RA. Artificial intelligence in mental health care: a scoping review of reviews. Front Psychiatry. 2026;17:1688043.</w:t>
       </w:r>
     </w:p>
     <w:p>

</xml_diff>

<commit_message>
all works of rsearch paper done
</commit_message>
<xml_diff>
--- a/Sentinel_V4.docx
+++ b/Sentinel_V4.docx
@@ -1248,7 +1248,7 @@
       </w:r>
       <w:proofErr w:type="spellEnd"/>
       <w:r>
-        <w:t xml:space="preserve"> data. Sentinel is architected throughout as a standalone Android application rather than a modification to system software: it requests the same usage-access and activity-recognition permissions already granted to existing digital-wellbeing and screen-time applications, a deployment path with direct precedent in shipped consumer apps (</w:t>
+        <w:t xml:space="preserve"> data — delivered, per Section 3.6, via operating-system handoff rather than a Sentinel-originated network call. Sentinel is architected throughout as a standalone Android application rather than a modification to system software: it requests the same usage-access and activity-recognition permissions already granted to existing digital-wellbeing and screen-time applications, a deployment path with direct precedent in shipped consumer apps (</w:t>
       </w:r>
       <w:proofErr w:type="spellStart"/>
       <w:r>
@@ -2352,6 +2352,15 @@
       </w:pPr>
       <w:r>
         <w:t>Delivery is text by default. Where a call path is included, it is a one-tap call action inside the text — the same pattern Table 1 already uses for Tele MANAS at Tier 2 (“one-tap connection”) — so that a human places the call, not Sentinel. An autonomous outbound call is not proposed: reliability is uncertain, missed or unanswered calls would need a defined fallback the paper cannot specify responsibly, and a synthesized voice describing a mental health crisis is difficult to distinguish from unwanted robocall traffic. There is deliberately no retry or escalation-on-no-response logic on this channel: Tele MANAS surfacing to the user already fires immediately and unconditionally at Tier 3, independent of what happens on the friend channel, so the friend contact is additive rather than a single point of failure. Adding automatic escalation if the contact does not respond would reintroduce exactly the automated-dispatch pattern Section 3.5 already excludes on principle. Finally, before a user confirms a Tier 3 contact, they see the literal message text that would be sent — a setup-time preview that operationalizes the consent-specificity commitment made in Section 5.6: “I agree to have my friend contacted” and “I agree to this exact message” are different levels of consent, and only the preview satisfies the second.</w:t>
+      </w:r>
+    </w:p>
+    <w:p>
+      <w:pPr>
+        <w:spacing w:after="200" w:line="276" w:lineRule="auto"/>
+        <w:jc w:val="both"/>
+      </w:pPr>
+      <w:r>
+        <w:t xml:space="preserve">Both channels are specified as operating-system intent handoffs — ACTION_DIAL for the Tele MANAS or emergency call, a share intent to the user’s own messaging app for the Tier 3 text — rather than an in-app network call. This is a direct consequence of the Stage 0 zero-egress analysis in Section 4.3: it means Sentinel’s own process never touches the network at any tier, the message transits through a channel (the carrier’s voice network, the messaging app’s own transport encryption) the user already trusts rather than one Sentinel would need to independently justify, and the resulting build can decline the INTERNET permission entirely — the single strongest form the zero-knowledge claim in Section 5.1 can take.</w:t>
       </w:r>
     </w:p>
     <w:p>
@@ -3118,6 +3127,15 @@
     </w:p>
     <w:p>
       <w:pPr>
+        <w:spacing w:after="200" w:line="276" w:lineRule="auto"/>
+        <w:jc w:val="both"/>
+      </w:pPr>
+      <w:r>
+        <w:t xml:space="preserve">Three Stage 0 sub-checks have preliminary results as of this writing, reported with the same calibration this paper applies everywhere else. A hand-implemented split-conformal procedure achieved 90.0% empirical coverage against a 90% target on a synthetic behavioral cohort constructed to match the direction of correlation reported in [3, 4], confirming the calibration mechanism performs as specified on data with known structure. Separately, PHQ-9 and sleep-quality survey responses from 46 students in the public StudentLife dataset showed a trend consistent in direction with [3, 4] between self-rated sleep quality and PHQ-9 severity (r = -0.263, p = 0.077) — a modest, cross-sectional, non-significant result reported as preliminary evidence rather than confirmation; a parallel check against self-reported sleep hours was non-significant and ran in the opposite direction (r = 0.198, p = 0.186), plausibly because PHQ-9’s own sleep item conflates insomnia with hypersomnia in a way a single duration figure cannot separate. A naive keyword baseline evaluated against a 24-case synthetic EMA test set targeting known classifier failure modes (metaphorical language, historical disclosure, direction-of-threat confusion) missed 6 of 24 cases, including two genuine-risk cases lacking explicit keywords — establishing a floor for the MindGuard integration in Section 3.6 to improve on, not a validation of MindGuard itself. Code for all three checks is available per the Code and Data Availability statement below.</w:t>
+      </w:r>
+    </w:p>
+    <w:p>
+      <w:pPr>
         <w:pStyle w:val="Heading2"/>
         <w:spacing w:before="280"/>
       </w:pPr>
@@ -3527,7 +3545,7 @@
       </w:r>
       <w:proofErr w:type="spellEnd"/>
       <w:r>
-        <w:t xml:space="preserve"> turn-classifier integration and the Tier 3 message-template library (Section 3.6) against representative EMA transcripts and clinician review, and direct engagement with Tele MANAS on both the harm-to-others routing question and the counsellor-obligation and non-</w:t>
+        <w:t xml:space="preserve"> turn-classifier integration and the Tier 3 message-template library (Section 3.6) against representative EMA transcripts and clinician review — a naive keyword baseline has already been run against a 24-case synthetic set as a preliminary floor (Section 4.3), but the real MindGuard model and its own released benchmark remain to be evaluated — and direct engagement with Tele MANAS on both the harm-to-others routing question and the counsellor-obligation and non-</w:t>
       </w:r>
       <w:r>
         <w:lastRenderedPageBreak/>
@@ -3550,6 +3568,24 @@
       </w:pPr>
       <w:r>
         <w:t>If these steps are completed and the staged gates are met rather than assumed, the architecture proposed here offers a plausible path toward passive mental-health monitoring that does not require choosing between clinical usefulness and zero-knowledge privacy — and that remains reachable by a person who does not want a single other human being in their life to find out, provided they are willing to accept help from a stranger who cannot identify them. It does not, on its own, offer more than that — and the paper is written to make that boundary legible rather than to obscure it.</w:t>
+      </w:r>
+    </w:p>
+    <w:p>
+      <w:pPr>
+        <w:pStyle w:val="Heading1"/>
+        <w:spacing w:before="400"/>
+      </w:pPr>
+      <w:r>
+        <w:t xml:space="preserve">Code and Data Availability</w:t>
+      </w:r>
+    </w:p>
+    <w:p>
+      <w:pPr>
+        <w:spacing w:after="200" w:line="276" w:lineRule="auto"/>
+        <w:jc w:val="both"/>
+      </w:pPr>
+      <w:r>
+        <w:t xml:space="preserve">Code for the Stage 0 preliminary validation described in Section 4.3 — the conformal-prediction implementation, the MindGuard evaluation harness, and the synthetic EMA test set — is available at [repository URL, to be added on publication]. Third-party data and models referenced in this validation — the StudentLife dataset and the MindGuard classifier and its benchmark test set — are not redistributed and must be obtained from their original sources under their own respective terms.</w:t>
       </w:r>
     </w:p>
     <w:p>

</xml_diff>

<commit_message>
done some necessary changes to v4
</commit_message>
<xml_diff>
--- a/Sentinel_V4.docx
+++ b/Sentinel_V4.docx
@@ -1337,6 +1337,30 @@
     </w:p>
     <w:p>
       <w:pPr>
+        <w:spacing w:after="200" w:line="276" w:lineRule="auto"/>
+        <w:jc w:val="both"/>
+      </w:pPr>
+      <w:r>
+        <w:rPr>
+          <w:sz w:val="22"/>
+        </w:rPr>
+      </w:r>
+      <w:r>
+        <w:rPr>
+          <w:b/>
+          <w:sz w:val="22"/>
+        </w:rPr>
+        <w:t>Operational definitions.</w:t>
+      </w:r>
+      <w:r>
+        <w:rPr>
+          <w:sz w:val="22"/>
+        </w:rPr>
+        <w:t xml:space="preserve"> To keep the terms used throughout this paper auditable rather than impressionistic, three are defined precisely here rather than left to context. An anomaly is a deviation of z ≥ 2.5 (two-tailed) from a user’s own personal 7–14 day rolling baseline — not a population norm — in mobility, sleep, or app-usage features, sustained across a minimum 48-hour window rather than triggered by a single data point; the threshold and window are specified defaults for Stage 0 tuning (Section 4.3), not empirically validated constants. Risk denotes the conformal prediction set produced by Phase 2 (Section 3.3): not a point probability, but a calibrated range constructed to satisfy the paper’s stated 90% empirical coverage target, following [24]. Clinical-range describes a feature vector whose corresponding self-report or generated EMA content aligns with an established clinical cutoff — PHQ-9 ≥ 10, GAD-7 ≥ 10 — as retrieved through the RAG lexicons in Section 3.3, not a claim that Sentinel independently derives or validates these cutoffs; they are imported from the instruments themselves.</w:t>
+      </w:r>
+    </w:p>
+    <w:p>
+      <w:pPr>
         <w:pStyle w:val="Heading2"/>
         <w:spacing w:before="280"/>
       </w:pPr>
@@ -1560,6 +1584,311 @@
       <w:proofErr w:type="gramEnd"/>
       <w:r>
         <w:t xml:space="preserve"> baseline) runs in parallel, with disagreement between the two treated as a built-in signal of low confidence rather than averaged away. The ensemble output is wrapped in conformal prediction, following the demonstrated pattern from wearable-derived psychiatric classification [24], so that Sentinel reports a calibrated risk range with a statistical coverage guarantee rather than a single, falsely precise number.</w:t>
+      </w:r>
+    </w:p>
+    <w:tbl>
+      <w:tblPr>
+        <w:tblW w:type="auto" w:w="0"/>
+        <w:jc w:val="center"/>
+        <w:tblLayout w:type="fixed"/>
+        <w:tblLook w:firstColumn="1" w:firstRow="1" w:lastColumn="0" w:lastRow="0" w:noHBand="0" w:noVBand="1" w:val="04A0"/>
+        <w:tblBorders>
+          <w:top w:val="single" w:sz="4" w:space="0" w:color="999999"/>
+          <w:left w:val="single" w:sz="4" w:space="0" w:color="999999"/>
+          <w:bottom w:val="single" w:sz="4" w:space="0" w:color="999999"/>
+          <w:right w:val="single" w:sz="4" w:space="0" w:color="999999"/>
+          <w:insideH w:val="single" w:sz="2" w:space="0" w:color="CCCCCC"/>
+          <w:insideV w:val="single" w:sz="2" w:space="0" w:color="CCCCCC"/>
+        </w:tblBorders>
+      </w:tblPr>
+      <w:tblGrid>
+        <w:gridCol w:w="9360"/>
+      </w:tblGrid>
+      <w:tr>
+        <w:tc>
+          <w:tcPr>
+            <w:tcW w:type="dxa" w:w="9026"/>
+            <w:shd w:val="clear" w:color="auto" w:fill="1F3A3D"/>
+          </w:tcPr>
+          <w:p>
+            <w:r/>
+            <w:r>
+              <w:rPr>
+                <w:rFonts w:ascii="Calibri" w:hAnsi="Calibri"/>
+                <w:b/>
+                <w:color w:val="FFFFFF"/>
+                <w:sz w:val="20"/>
+              </w:rPr>
+              <w:t>Algorithm 1: Phase 2 — Ensemble Detection with Conformal Calibration</w:t>
+            </w:r>
+          </w:p>
+        </w:tc>
+      </w:tr>
+      <w:tr>
+        <w:tc>
+          <w:tcPr>
+            <w:tcW w:type="dxa" w:w="9026"/>
+          </w:tcPr>
+          <w:p>
+            <w:pPr>
+              <w:ind w:left="200"/>
+            </w:pPr>
+            <w:r/>
+            <w:r>
+              <w:rPr>
+                <w:rFonts w:ascii="Courier New" w:hAnsi="Courier New"/>
+                <w:color w:val="1A2B2E"/>
+                <w:sz w:val="18"/>
+              </w:rPr>
+              <w:t>Require: feature vector x_t; personal baseline window W (7–14 days); calibration residuals from Stage 0 (Section 4.3); target coverage 1−α = 0.90</w:t>
+            </w:r>
+          </w:p>
+        </w:tc>
+      </w:tr>
+      <w:tr>
+        <w:tc>
+          <w:tcPr>
+            <w:tcW w:type="dxa" w:w="9026"/>
+          </w:tcPr>
+          <w:p>
+            <w:pPr>
+              <w:ind w:left="480"/>
+            </w:pPr>
+            <w:r/>
+            <w:r>
+              <w:rPr>
+                <w:rFonts w:ascii="Courier New" w:hAnsi="Courier New"/>
+                <w:color w:val="1A2B2E"/>
+                <w:sz w:val="18"/>
+              </w:rPr>
+              <w:t>1:   s_IF ← IsolationForest.score(x_t)</w:t>
+            </w:r>
+          </w:p>
+        </w:tc>
+      </w:tr>
+      <w:tr>
+        <w:tc>
+          <w:tcPr>
+            <w:tcW w:type="dxa" w:w="9026"/>
+          </w:tcPr>
+          <w:p>
+            <w:pPr>
+              <w:ind w:left="480"/>
+            </w:pPr>
+            <w:r/>
+            <w:r>
+              <w:rPr>
+                <w:rFonts w:ascii="Courier New" w:hAnsi="Courier New"/>
+                <w:color w:val="1A2B2E"/>
+                <w:sz w:val="18"/>
+              </w:rPr>
+              <w:t>2:   s_z ← RollingZScore(x_t, W)                    // personal baseline, not population norm</w:t>
+            </w:r>
+          </w:p>
+        </w:tc>
+      </w:tr>
+      <w:tr>
+        <w:tc>
+          <w:tcPr>
+            <w:tcW w:type="dxa" w:w="9026"/>
+          </w:tcPr>
+          <w:p>
+            <w:pPr>
+              <w:ind w:left="480"/>
+            </w:pPr>
+            <w:r/>
+            <w:r>
+              <w:rPr>
+                <w:rFonts w:ascii="Courier New" w:hAnsi="Courier New"/>
+                <w:color w:val="1A2B2E"/>
+                <w:sz w:val="18"/>
+              </w:rPr>
+              <w:t>3:   if |s_IF − s_z| &gt; τ_disagree then</w:t>
+            </w:r>
+          </w:p>
+        </w:tc>
+      </w:tr>
+      <w:tr>
+        <w:tc>
+          <w:tcPr>
+            <w:tcW w:type="dxa" w:w="9026"/>
+          </w:tcPr>
+          <w:p>
+            <w:pPr>
+              <w:ind w:left="760"/>
+            </w:pPr>
+            <w:r/>
+            <w:r>
+              <w:rPr>
+                <w:rFonts w:ascii="Courier New" w:hAnsi="Courier New"/>
+                <w:color w:val="1A2B2E"/>
+                <w:sz w:val="18"/>
+              </w:rPr>
+              <w:t>4:   flag ← LOW_CONFIDENCE                       // ensemble disagreement, not averaged away</w:t>
+            </w:r>
+          </w:p>
+        </w:tc>
+      </w:tr>
+      <w:tr>
+        <w:tc>
+          <w:tcPr>
+            <w:tcW w:type="dxa" w:w="9026"/>
+          </w:tcPr>
+          <w:p>
+            <w:pPr>
+              <w:ind w:left="480"/>
+            </w:pPr>
+            <w:r/>
+            <w:r>
+              <w:rPr>
+                <w:rFonts w:ascii="Courier New" w:hAnsi="Courier New"/>
+                <w:color w:val="1A2B2E"/>
+                <w:sz w:val="18"/>
+              </w:rPr>
+              <w:t>5:   else</w:t>
+            </w:r>
+          </w:p>
+        </w:tc>
+      </w:tr>
+      <w:tr>
+        <w:tc>
+          <w:tcPr>
+            <w:tcW w:type="dxa" w:w="9026"/>
+          </w:tcPr>
+          <w:p>
+            <w:pPr>
+              <w:ind w:left="760"/>
+            </w:pPr>
+            <w:r/>
+            <w:r>
+              <w:rPr>
+                <w:rFonts w:ascii="Courier New" w:hAnsi="Courier New"/>
+                <w:color w:val="1A2B2E"/>
+                <w:sz w:val="18"/>
+              </w:rPr>
+              <w:t>6:   q ← ConformalQuantile(calibration_residuals, 1−α)   // split-conformal, Sec. 2.5</w:t>
+            </w:r>
+          </w:p>
+        </w:tc>
+      </w:tr>
+      <w:tr>
+        <w:tc>
+          <w:tcPr>
+            <w:tcW w:type="dxa" w:w="9026"/>
+          </w:tcPr>
+          <w:p>
+            <w:pPr>
+              <w:ind w:left="760"/>
+            </w:pPr>
+            <w:r/>
+            <w:r>
+              <w:rPr>
+                <w:rFonts w:ascii="Courier New" w:hAnsi="Courier New"/>
+                <w:color w:val="1A2B2E"/>
+                <w:sz w:val="18"/>
+              </w:rPr>
+              <w:t>7:   C(x_t) ← [ŷ_t − q, ŷ_t + q]                     // calibrated prediction SET, not a point</w:t>
+            </w:r>
+          </w:p>
+        </w:tc>
+      </w:tr>
+      <w:tr>
+        <w:tc>
+          <w:tcPr>
+            <w:tcW w:type="dxa" w:w="9026"/>
+          </w:tcPr>
+          <w:p>
+            <w:pPr>
+              <w:ind w:left="760"/>
+            </w:pPr>
+            <w:r/>
+            <w:r>
+              <w:rPr>
+                <w:rFonts w:ascii="Courier New" w:hAnsi="Courier New"/>
+                <w:color w:val="1A2B2E"/>
+                <w:sz w:val="18"/>
+              </w:rPr>
+              <w:t>8:   if C(x_t) crosses the Tier 2/3 threshold (Table 1) then</w:t>
+            </w:r>
+          </w:p>
+        </w:tc>
+      </w:tr>
+      <w:tr>
+        <w:tc>
+          <w:tcPr>
+            <w:tcW w:type="dxa" w:w="9026"/>
+          </w:tcPr>
+          <w:p>
+            <w:pPr>
+              <w:ind w:left="1040"/>
+            </w:pPr>
+            <w:r/>
+            <w:r>
+              <w:rPr>
+                <w:rFonts w:ascii="Courier New" w:hAnsi="Courier New"/>
+                <w:color w:val="1A2B2E"/>
+                <w:sz w:val="18"/>
+              </w:rPr>
+              <w:t>9:   route → Phase 3 EMA check-in; MindGuard fast path runs in parallel (Sec. 3.6)</w:t>
+            </w:r>
+          </w:p>
+        </w:tc>
+      </w:tr>
+      <w:tr>
+        <w:tc>
+          <w:tcPr>
+            <w:tcW w:type="dxa" w:w="9026"/>
+          </w:tcPr>
+          <w:p>
+            <w:pPr>
+              <w:ind w:left="760"/>
+            </w:pPr>
+            <w:r/>
+            <w:r>
+              <w:rPr>
+                <w:rFonts w:ascii="Courier New" w:hAnsi="Courier New"/>
+                <w:color w:val="1A2B2E"/>
+                <w:sz w:val="18"/>
+              </w:rPr>
+              <w:t>10:  end if</w:t>
+            </w:r>
+          </w:p>
+        </w:tc>
+      </w:tr>
+      <w:tr>
+        <w:tc>
+          <w:tcPr>
+            <w:tcW w:type="dxa" w:w="9026"/>
+          </w:tcPr>
+          <w:p>
+            <w:pPr>
+              <w:ind w:left="480"/>
+            </w:pPr>
+            <w:r/>
+            <w:r>
+              <w:rPr>
+                <w:rFonts w:ascii="Courier New" w:hAnsi="Courier New"/>
+                <w:color w:val="1A2B2E"/>
+                <w:sz w:val="18"/>
+              </w:rPr>
+              <w:t>11:  end if</w:t>
+            </w:r>
+          </w:p>
+        </w:tc>
+      </w:tr>
+    </w:tbl>
+    <w:p>
+      <w:pPr>
+        <w:spacing w:after="200" w:line="276" w:lineRule="auto"/>
+        <w:jc w:val="center"/>
+      </w:pPr>
+      <w:r/>
+      <w:r>
+        <w:rPr>
+          <w:i/>
+          <w:sz w:val="20"/>
+        </w:rPr>
+        <w:t>Algorithm 1 formalizes the Phase 2 procedure described above: two independent scores, an explicit disagreement check rather than a silently averaged ensemble, and a conformal quantile applied only after that check passes — producing a calibrated set, not a point score, as input to Table 1's tier routing.</w:t>
       </w:r>
     </w:p>
     <w:p>
@@ -3136,10 +3465,409 @@
     </w:p>
     <w:p>
       <w:pPr>
+        <w:spacing w:after="200" w:line="276" w:lineRule="auto"/>
+        <w:jc w:val="both"/>
+      </w:pPr>
+      <w:r>
+        <w:t xml:space="preserve">An ablation plan is specified alongside these checks rather than left implicit: Stage 0 will systematically remove one behavioral modality at a time from the Phase 2 ensemble — keystroke dynamics, sleep, app usage, in turn — and re-measure both detection performance and conformal calibration error on the same held-out cohort, isolating each signal’s marginal contribution rather than reporting only the ensemble’s combined result. This is planned rather than completed, consistent with how the rest of Stage 0 is reported above.</w:t>
+      </w:r>
+    </w:p>
+    <w:p>
+      <w:pPr>
         <w:pStyle w:val="Heading2"/>
         <w:spacing w:before="280"/>
       </w:pPr>
       <w:r>
+        <w:t xml:space="preserve">Claims and Evidence</w:t>
+      </w:r>
+    </w:p>
+    <w:p>
+      <w:pPr>
+        <w:spacing w:after="200" w:line="276" w:lineRule="auto"/>
+        <w:jc w:val="both"/>
+      </w:pPr>
+      <w:r>
+        <w:t xml:space="preserve">Table 3 consolidates the paper’s major claims against their current evidentiary status — what is specified, what is demonstrated on synthetic or preliminary real data, and what remains an architectural commitment rather than an empirical result — as a single reference point rather than requiring each claim to be traced back through its originating section.</w:t>
+      </w:r>
+    </w:p>
+    <w:tbl>
+      <w:tblPr>
+        <w:tblW w:type="auto" w:w="0"/>
+        <w:jc w:val="center"/>
+        <w:tblLayout w:type="fixed"/>
+        <w:tblLook w:firstColumn="1" w:firstRow="1" w:lastColumn="0" w:lastRow="0" w:noHBand="0" w:noVBand="1" w:val="04A0"/>
+        <w:tblBorders>
+          <w:top w:val="single" w:sz="4" w:space="0" w:color="999999"/>
+          <w:left w:val="single" w:sz="4" w:space="0" w:color="999999"/>
+          <w:bottom w:val="single" w:sz="4" w:space="0" w:color="999999"/>
+          <w:right w:val="single" w:sz="4" w:space="0" w:color="999999"/>
+          <w:insideH w:val="single" w:sz="2" w:space="0" w:color="CCCCCC"/>
+          <w:insideV w:val="single" w:sz="2" w:space="0" w:color="CCCCCC"/>
+        </w:tblBorders>
+      </w:tblPr>
+      <w:tblGrid>
+        <w:gridCol w:w="3700"/>
+        <w:gridCol w:w="5660"/>
+      </w:tblGrid>
+      <w:tr>
+        <w:tc>
+          <w:tcPr>
+            <w:tcW w:type="dxa" w:w="3700"/>
+            <w:shd w:val="clear" w:color="auto" w:fill="1F3A3D"/>
+          </w:tcPr>
+          <w:p>
+            <w:pPr>
+              <w:spacing w:after="0"/>
+            </w:pPr>
+            <w:r/>
+            <w:r>
+              <w:rPr>
+                <w:rFonts w:ascii="Calibri" w:hAnsi="Calibri"/>
+                <w:b/>
+                <w:color w:val="FFFFFF"/>
+                <w:sz w:val="20"/>
+              </w:rPr>
+              <w:t>Claim</w:t>
+            </w:r>
+          </w:p>
+        </w:tc>
+        <w:tc>
+          <w:tcPr>
+            <w:tcW w:type="dxa" w:w="5660"/>
+            <w:shd w:val="clear" w:color="auto" w:fill="1F3A3D"/>
+          </w:tcPr>
+          <w:p>
+            <w:pPr>
+              <w:spacing w:after="0"/>
+            </w:pPr>
+            <w:r/>
+            <w:r>
+              <w:rPr>
+                <w:rFonts w:ascii="Calibri" w:hAnsi="Calibri"/>
+                <w:b/>
+                <w:color w:val="FFFFFF"/>
+                <w:sz w:val="20"/>
+              </w:rPr>
+              <w:t>Supporting Evidence / Status</w:t>
+            </w:r>
+          </w:p>
+        </w:tc>
+      </w:tr>
+      <w:tr>
+        <w:tc>
+          <w:tcPr>
+            <w:tcW w:type="dxa" w:w="3700"/>
+          </w:tcPr>
+          <w:p>
+            <w:pPr>
+              <w:spacing w:after="0"/>
+            </w:pPr>
+            <w:r/>
+            <w:r>
+              <w:rPr>
+                <w:rFonts w:ascii="Calibri" w:hAnsi="Calibri"/>
+                <w:b w:val="0"/>
+                <w:color w:val="1A2B2E"/>
+                <w:sz w:val="20"/>
+              </w:rPr>
+              <w:t>Continuous on-device inference is computationally feasible.</w:t>
+            </w:r>
+          </w:p>
+        </w:tc>
+        <w:tc>
+          <w:tcPr>
+            <w:tcW w:type="dxa" w:w="5660"/>
+          </w:tcPr>
+          <w:p>
+            <w:pPr>
+              <w:spacing w:after="0"/>
+            </w:pPr>
+            <w:r/>
+            <w:r>
+              <w:rPr>
+                <w:rFonts w:ascii="Calibri" w:hAnsi="Calibri"/>
+                <w:b w:val="0"/>
+                <w:color w:val="1A2B2E"/>
+                <w:sz w:val="20"/>
+              </w:rPr>
+              <w:t>Specification: MobileBERT (25.3M params) and 4-bit-quantized Gemma 4 E2B fit documented Android memory budgets (Section 4.2); on-device latency/memory/battery benchmarking remains Stage 0/1 work, not yet measured.</w:t>
+            </w:r>
+          </w:p>
+        </w:tc>
+      </w:tr>
+      <w:tr>
+        <w:tc>
+          <w:tcPr>
+            <w:tcW w:type="dxa" w:w="3700"/>
+          </w:tcPr>
+          <w:p>
+            <w:pPr>
+              <w:spacing w:after="0"/>
+            </w:pPr>
+            <w:r/>
+            <w:r>
+              <w:rPr>
+                <w:rFonts w:ascii="Calibri" w:hAnsi="Calibri"/>
+                <w:b w:val="0"/>
+                <w:color w:val="1A2B2E"/>
+                <w:sz w:val="20"/>
+              </w:rPr>
+              <w:t>Conformal calibration delivers the stated coverage guarantee.</w:t>
+            </w:r>
+          </w:p>
+        </w:tc>
+        <w:tc>
+          <w:tcPr>
+            <w:tcW w:type="dxa" w:w="5660"/>
+          </w:tcPr>
+          <w:p>
+            <w:pPr>
+              <w:spacing w:after="0"/>
+            </w:pPr>
+            <w:r/>
+            <w:r>
+              <w:rPr>
+                <w:rFonts w:ascii="Calibri" w:hAnsi="Calibri"/>
+                <w:b w:val="0"/>
+                <w:color w:val="1A2B2E"/>
+                <w:sz w:val="20"/>
+              </w:rPr>
+              <w:t>Demonstrated (synthetic): hand-implemented split-conformal procedure achieved 90.0% empirical coverage against a 90% target (Section 4.3).</w:t>
+            </w:r>
+          </w:p>
+        </w:tc>
+      </w:tr>
+      <w:tr>
+        <w:tc>
+          <w:tcPr>
+            <w:tcW w:type="dxa" w:w="3700"/>
+          </w:tcPr>
+          <w:p>
+            <w:pPr>
+              <w:spacing w:after="0"/>
+            </w:pPr>
+            <w:r/>
+            <w:r>
+              <w:rPr>
+                <w:rFonts w:ascii="Calibri" w:hAnsi="Calibri"/>
+                <w:b w:val="0"/>
+                <w:color w:val="1A2B2E"/>
+                <w:sz w:val="20"/>
+              </w:rPr>
+              <w:t>Passive behavioral signal correlates with depression severity.</w:t>
+            </w:r>
+          </w:p>
+        </w:tc>
+        <w:tc>
+          <w:tcPr>
+            <w:tcW w:type="dxa" w:w="5660"/>
+          </w:tcPr>
+          <w:p>
+            <w:pPr>
+              <w:spacing w:after="0"/>
+            </w:pPr>
+            <w:r/>
+            <w:r>
+              <w:rPr>
+                <w:rFonts w:ascii="Calibri" w:hAnsi="Calibri"/>
+                <w:b w:val="0"/>
+                <w:color w:val="1A2B2E"/>
+                <w:sz w:val="20"/>
+              </w:rPr>
+              <w:t>Preliminary (real data): PHQ-9 vs. sleep-quality trend on n=46 real StudentLife respondents, correct direction, not significant (r=-0.263, p=0.077; Section 4.3).</w:t>
+            </w:r>
+          </w:p>
+        </w:tc>
+      </w:tr>
+      <w:tr>
+        <w:tc>
+          <w:tcPr>
+            <w:tcW w:type="dxa" w:w="3700"/>
+          </w:tcPr>
+          <w:p>
+            <w:pPr>
+              <w:spacing w:after="0"/>
+            </w:pPr>
+            <w:r/>
+            <w:r>
+              <w:rPr>
+                <w:rFonts w:ascii="Calibri" w:hAnsi="Calibri"/>
+                <w:b w:val="0"/>
+                <w:color w:val="1A2B2E"/>
+                <w:sz w:val="20"/>
+              </w:rPr>
+              <w:t>Turn-level classification reduces false-positive harm-routing.</w:t>
+            </w:r>
+          </w:p>
+        </w:tc>
+        <w:tc>
+          <w:tcPr>
+            <w:tcW w:type="dxa" w:w="5660"/>
+          </w:tcPr>
+          <w:p>
+            <w:pPr>
+              <w:spacing w:after="0"/>
+            </w:pPr>
+            <w:r/>
+            <w:r>
+              <w:rPr>
+                <w:rFonts w:ascii="Calibri" w:hAnsi="Calibri"/>
+                <w:b w:val="0"/>
+                <w:color w:val="1A2B2E"/>
+                <w:sz w:val="20"/>
+              </w:rPr>
+              <w:t>Preliminary (naive baseline only): a keyword baseline missed 6/24 synthetic cases (Section 4.3); the real MindGuard model and its own benchmark remain to be evaluated.</w:t>
+            </w:r>
+          </w:p>
+        </w:tc>
+      </w:tr>
+      <w:tr>
+        <w:tc>
+          <w:tcPr>
+            <w:tcW w:type="dxa" w:w="3700"/>
+          </w:tcPr>
+          <w:p>
+            <w:pPr>
+              <w:spacing w:after="0"/>
+            </w:pPr>
+            <w:r/>
+            <w:r>
+              <w:rPr>
+                <w:rFonts w:ascii="Calibri" w:hAnsi="Calibri"/>
+                <w:b w:val="0"/>
+                <w:color w:val="1A2B2E"/>
+                <w:sz w:val="20"/>
+              </w:rPr>
+              <w:t>Zero-knowledge architecture prevents third-party data access.</w:t>
+            </w:r>
+          </w:p>
+        </w:tc>
+        <w:tc>
+          <w:tcPr>
+            <w:tcW w:type="dxa" w:w="5660"/>
+          </w:tcPr>
+          <w:p>
+            <w:pPr>
+              <w:spacing w:after="0"/>
+            </w:pPr>
+            <w:r/>
+            <w:r>
+              <w:rPr>
+                <w:rFonts w:ascii="Calibri" w:hAnsi="Calibri"/>
+                <w:b w:val="0"/>
+                <w:color w:val="1A2B2E"/>
+                <w:sz w:val="20"/>
+              </w:rPr>
+              <w:t>Architectural specification: SQLCipher + StrongBox/TEE keystore, intent-handoff design requiring no INTERNET permission (Sections 3.4, 3.6); static/dynamic network verification is a Stage 0 item not yet run.</w:t>
+            </w:r>
+          </w:p>
+        </w:tc>
+      </w:tr>
+      <w:tr>
+        <w:tc>
+          <w:tcPr>
+            <w:tcW w:type="dxa" w:w="3700"/>
+          </w:tcPr>
+          <w:p>
+            <w:pPr>
+              <w:spacing w:after="0"/>
+            </w:pPr>
+            <w:r/>
+            <w:r>
+              <w:rPr>
+                <w:rFonts w:ascii="Calibri" w:hAnsi="Calibri"/>
+                <w:b w:val="0"/>
+                <w:color w:val="1A2B2E"/>
+                <w:sz w:val="20"/>
+              </w:rPr>
+              <w:t>Escalation defaults to human-staffed infrastructure over automated dispatch.</w:t>
+            </w:r>
+          </w:p>
+        </w:tc>
+        <w:tc>
+          <w:tcPr>
+            <w:tcW w:type="dxa" w:w="5660"/>
+          </w:tcPr>
+          <w:p>
+            <w:pPr>
+              <w:spacing w:after="0"/>
+            </w:pPr>
+            <w:r/>
+            <w:r>
+              <w:rPr>
+                <w:rFonts w:ascii="Calibri" w:hAnsi="Calibri"/>
+                <w:b w:val="0"/>
+                <w:color w:val="1A2B2E"/>
+                <w:sz w:val="20"/>
+              </w:rPr>
+              <w:t>Design commitment, not an empirical claim: Table 1's tier structure and Section 3.5's explicit rejection of automated authority dispatch.</w:t>
+            </w:r>
+          </w:p>
+        </w:tc>
+      </w:tr>
+      <w:tr>
+        <w:tc>
+          <w:tcPr>
+            <w:tcW w:type="dxa" w:w="3700"/>
+          </w:tcPr>
+          <w:p>
+            <w:pPr>
+              <w:spacing w:after="0"/>
+            </w:pPr>
+            <w:r/>
+            <w:r>
+              <w:rPr>
+                <w:rFonts w:ascii="Calibri" w:hAnsi="Calibri"/>
+                <w:b w:val="0"/>
+                <w:color w:val="1A2B2E"/>
+                <w:sz w:val="20"/>
+              </w:rPr>
+              <w:t>Suicide-risk point-prediction is not achievable at clinically useful accuracy.</w:t>
+            </w:r>
+          </w:p>
+        </w:tc>
+        <w:tc>
+          <w:tcPr>
+            <w:tcW w:type="dxa" w:w="5660"/>
+          </w:tcPr>
+          <w:p>
+            <w:pPr>
+              <w:spacing w:after="0"/>
+            </w:pPr>
+            <w:r/>
+            <w:r>
+              <w:rPr>
+                <w:rFonts w:ascii="Calibri" w:hAnsi="Calibri"/>
+                <w:b w:val="0"/>
+                <w:color w:val="1A2B2E"/>
+                <w:sz w:val="20"/>
+              </w:rPr>
+              <w:t>Supported by prior literature, not original to this paper: Franklin et al.'s 50-year null result [18], Belsher et al. [19].</w:t>
+            </w:r>
+          </w:p>
+        </w:tc>
+      </w:tr>
+    </w:tbl>
+    <w:p>
+      <w:pPr>
+        <w:spacing w:after="200" w:line="276" w:lineRule="auto"/>
+        <w:jc w:val="center"/>
+      </w:pPr>
+      <w:r/>
+      <w:r>
+        <w:rPr>
+          <w:i/>
+          <w:sz w:val="20"/>
+        </w:rPr>
+        <w:t>Table 3: Claims and Evidence mapping.</w:t>
+      </w:r>
+    </w:p>
+    <w:p>
+      <w:pPr>
+        <w:pStyle w:val="Heading2"/>
+        <w:spacing w:before="280"/>
+      </w:pPr>
+      <w:r>
         <w:t>4.4 Anticipated Regulatory Context</w:t>
       </w:r>
     </w:p>
@@ -3585,7 +4313,7 @@
         <w:jc w:val="both"/>
       </w:pPr>
       <w:r>
-        <w:t xml:space="preserve">Code for the Stage 0 preliminary validation described in Section 4.3 — the conformal-prediction implementation, the MindGuard evaluation harness, and the synthetic EMA test set — is available at [repository URL, to be added on publication]. Third-party data and models referenced in this validation — the StudentLife dataset and the MindGuard classifier and its benchmark test set — are not redistributed and must be obtained from their original sources under their own respective terms.</w:t>
+        <w:t>Code for the Stage 0 preliminary validation described in Section 4.3 — the conformal-prediction implementation, the MindGuard evaluation harness, and the synthetic EMA test set — is available at https://github.com/AmbitiousAnant/RESEARCH-MENTAL-HEALTH-EVALUATOR-AND-RETALIATION-MODEL/tree/main/Stage0/stage0_starter_kit/stage0. Third-party data and models referenced in this validation — the StudentLife dataset and the MindGuard classifier and its benchmark test set — are not redistributed and must be obtained from their original sources under their own respective terms.</w:t>
       </w:r>
     </w:p>
     <w:p>
@@ -3973,7 +4701,7 @@
           <w:sz w:val="21"/>
           <w:szCs w:val="21"/>
         </w:rPr>
-        <w:t>[7] Triaging casual from critical: leveraging machine learning to detect self-harm and suicide risks for youth on social media. JMIR Ment Health, 2026. (Full author byline to be confirmed against primary source before submission.)</w:t>
+        <w:t>[7] Qadir S, Alsoubai A, Park JK, Ali NS, Choudhury MD, Wisniewski P. Triaging Casual From Critical—Leveraging Machine Learning to Detect Self-Harm and Suicide Risks for Youth on Social Media: Algorithm Development and Validation Study. JMIR Ment Health. 2026;13:e76051.</w:t>
       </w:r>
     </w:p>
     <w:p>

</xml_diff>